<commit_message>
changes and service file added
</commit_message>
<xml_diff>
--- a/Major_Project_Documentation.docx
+++ b/Major_Project_Documentation.docx
@@ -3734,6 +3734,9 @@
       <w:pPr>
         <w:pStyle w:val="Heading1"/>
         <w:pageBreakBefore/>
+        <w:rPr>
+          <w:noProof/>
+        </w:rPr>
       </w:pPr>
       <w:r>
         <w:lastRenderedPageBreak/>
@@ -3750,10 +3753,10 @@
           <w:noProof/>
         </w:rPr>
         <w:drawing>
-          <wp:inline distT="0" distB="0" distL="0" distR="0" wp14:anchorId="327D8AA3" wp14:editId="6E26DAC3">
-            <wp:extent cx="6012815" cy="6381750"/>
-            <wp:effectExtent l="19050" t="19050" r="26035" b="19050"/>
-            <wp:docPr id="1517312904" name="Picture 21"/>
+          <wp:inline distT="0" distB="0" distL="0" distR="0" wp14:anchorId="67AE25F6" wp14:editId="07055B3D">
+            <wp:extent cx="5943411" cy="7781059"/>
+            <wp:effectExtent l="19050" t="19050" r="19685" b="10795"/>
+            <wp:docPr id="218344145" name="Picture 19"/>
             <wp:cNvGraphicFramePr>
               <a:graphicFrameLocks xmlns:a="http://schemas.openxmlformats.org/drawingml/2006/main" noChangeAspect="1"/>
             </wp:cNvGraphicFramePr>
@@ -3761,12 +3764,12 @@
               <a:graphicData uri="http://schemas.openxmlformats.org/drawingml/2006/picture">
                 <pic:pic xmlns:pic="http://schemas.openxmlformats.org/drawingml/2006/picture">
                   <pic:nvPicPr>
-                    <pic:cNvPr id="0" name="Picture 5"/>
+                    <pic:cNvPr id="0" name="Picture 3"/>
                     <pic:cNvPicPr>
                       <a:picLocks noChangeAspect="1" noChangeArrowheads="1"/>
                     </pic:cNvPicPr>
                   </pic:nvPicPr>
-                  <pic:blipFill>
+                  <pic:blipFill rotWithShape="1">
                     <a:blip r:embed="rId8">
                       <a:extLst>
                         <a:ext uri="{28A0092B-C50C-407E-A947-70E740481C1C}">
@@ -3774,7 +3777,7 @@
                         </a:ext>
                       </a:extLst>
                     </a:blip>
-                    <a:srcRect/>
+                    <a:srcRect b="6568"/>
                     <a:stretch>
                       <a:fillRect/>
                     </a:stretch>
@@ -3782,17 +3785,41 @@
                   <pic:spPr bwMode="auto">
                     <a:xfrm>
                       <a:off x="0" y="0"/>
-                      <a:ext cx="6025180" cy="6394874"/>
+                      <a:ext cx="5951185" cy="7791236"/>
                     </a:xfrm>
                     <a:prstGeom prst="rect">
                       <a:avLst/>
                     </a:prstGeom>
                     <a:noFill/>
-                    <a:ln>
+                    <a:ln w="9525" cap="flat" cmpd="sng" algn="ctr">
                       <a:solidFill>
-                        <a:schemeClr val="tx1"/>
+                        <a:sysClr val="windowText" lastClr="000000"/>
                       </a:solidFill>
+                      <a:prstDash val="solid"/>
+                      <a:round/>
+                      <a:headEnd type="none" w="med" len="med"/>
+                      <a:tailEnd type="none" w="med" len="med"/>
+                      <a:extLst>
+                        <a:ext uri="{C807C97D-BFC1-408E-A445-0C87EB9F89A2}">
+                          <ask:lineSketchStyleProps xmlns:ask="http://schemas.microsoft.com/office/drawing/2018/sketchyshapes" sd="0">
+                            <a:custGeom>
+                              <a:avLst/>
+                              <a:gdLst/>
+                              <a:ahLst/>
+                              <a:cxnLst/>
+                              <a:rect l="0" t="0" r="0" b="0"/>
+                              <a:pathLst/>
+                            </a:custGeom>
+                            <ask:type/>
+                          </ask:lineSketchStyleProps>
+                        </a:ext>
+                      </a:extLst>
                     </a:ln>
+                    <a:extLst>
+                      <a:ext uri="{53640926-AAD7-44D8-BBD7-CCE9431645EC}">
+                        <a14:shadowObscured xmlns:a14="http://schemas.microsoft.com/office/drawing/2010/main"/>
+                      </a:ext>
+                    </a:extLst>
                   </pic:spPr>
                 </pic:pic>
               </a:graphicData>
@@ -3800,6 +3827,12 @@
           </wp:inline>
         </w:drawing>
       </w:r>
+    </w:p>
+    <w:p>
+      <w:pPr>
+        <w:pStyle w:val="Heading1"/>
+        <w:pageBreakBefore/>
+      </w:pPr>
     </w:p>
     <w:tbl>
       <w:tblPr>
@@ -10326,14 +10359,7 @@
           <w:sz w:val="22"/>
           <w:szCs w:val="22"/>
         </w:rPr>
-        <w:t>4</w:t>
-      </w:r>
-      <w:r>
-        <w:rPr>
-          <w:sz w:val="22"/>
-          <w:szCs w:val="22"/>
-        </w:rPr>
-        <w:t xml:space="preserve"> </w:t>
+        <w:t xml:space="preserve">4 </w:t>
       </w:r>
       <w:r>
         <w:rPr>
@@ -14154,6 +14180,7 @@
   <w:style w:type="character" w:default="1" w:styleId="DefaultParagraphFont">
     <w:name w:val="Default Paragraph Font"/>
     <w:uiPriority w:val="1"/>
+    <w:semiHidden/>
     <w:unhideWhenUsed/>
   </w:style>
   <w:style w:type="table" w:default="1" w:styleId="TableNormal">

</xml_diff>